<commit_message>
Update Week 2 notes and add One Hot Encoding
</commit_message>
<xml_diff>
--- a/Week_2/Week_2.docx
+++ b/Week_2/Week_2.docx
@@ -76,6 +76,76 @@
     </w:p>
     <w:p>
       <w:pPr>
+        <w:spacing w:after="120"/>
+      </w:pPr>
+    </w:p>
+    <w:p>
+      <w:pPr>
+        <w:spacing w:after="120"/>
+      </w:pPr>
+      <w:r>
+        <w:rPr>
+          <w:noProof/>
+        </w:rPr>
+        <w:drawing>
+          <wp:inline distT="0" distB="0" distL="0" distR="0" wp14:anchorId="1F8316DB" wp14:editId="769A176D">
+            <wp:extent cx="5943600" cy="3576320"/>
+            <wp:effectExtent l="76200" t="76200" r="133350" b="138430"/>
+            <wp:docPr id="296837192" name="Picture 2"/>
+            <wp:cNvGraphicFramePr>
+              <a:graphicFrameLocks xmlns:a="http://schemas.openxmlformats.org/drawingml/2006/main" noChangeAspect="1"/>
+            </wp:cNvGraphicFramePr>
+            <a:graphic xmlns:a="http://schemas.openxmlformats.org/drawingml/2006/main">
+              <a:graphicData uri="http://schemas.openxmlformats.org/drawingml/2006/picture">
+                <pic:pic xmlns:pic="http://schemas.openxmlformats.org/drawingml/2006/picture">
+                  <pic:nvPicPr>
+                    <pic:cNvPr id="296837192" name="Picture 296837192"/>
+                    <pic:cNvPicPr/>
+                  </pic:nvPicPr>
+                  <pic:blipFill>
+                    <a:blip r:embed="rId7">
+                      <a:extLst>
+                        <a:ext uri="{28A0092B-C50C-407E-A947-70E740481C1C}">
+                          <a14:useLocalDpi xmlns:a14="http://schemas.microsoft.com/office/drawing/2010/main" val="0"/>
+                        </a:ext>
+                      </a:extLst>
+                    </a:blip>
+                    <a:stretch>
+                      <a:fillRect/>
+                    </a:stretch>
+                  </pic:blipFill>
+                  <pic:spPr>
+                    <a:xfrm>
+                      <a:off x="0" y="0"/>
+                      <a:ext cx="5943600" cy="3576320"/>
+                    </a:xfrm>
+                    <a:prstGeom prst="rect">
+                      <a:avLst/>
+                    </a:prstGeom>
+                    <a:ln w="38100" cap="sq">
+                      <a:solidFill>
+                        <a:srgbClr val="000000"/>
+                      </a:solidFill>
+                      <a:prstDash val="solid"/>
+                      <a:miter lim="800000"/>
+                    </a:ln>
+                    <a:effectLst>
+                      <a:outerShdw blurRad="50800" dist="38100" dir="2700000" algn="tl" rotWithShape="0">
+                        <a:srgbClr val="000000">
+                          <a:alpha val="43000"/>
+                        </a:srgbClr>
+                      </a:outerShdw>
+                    </a:effectLst>
+                  </pic:spPr>
+                </pic:pic>
+              </a:graphicData>
+            </a:graphic>
+          </wp:inline>
+        </w:drawing>
+      </w:r>
+    </w:p>
+    <w:p>
+      <w:pPr>
         <w:pStyle w:val="Heading2"/>
         <w:spacing w:before="240" w:after="120"/>
       </w:pPr>
@@ -106,6 +176,7 @@
         <w:spacing w:after="60"/>
       </w:pPr>
       <w:r>
+        <w:lastRenderedPageBreak/>
         <w:t>Internal (Decision) Nodes: Represent a test on a feature.</w:t>
       </w:r>
     </w:p>
@@ -210,7 +281,7 @@
         <w:rPr>
           <w:rFonts w:ascii="Consolas" w:eastAsia="Consolas" w:hAnsi="Consolas" w:cs="Consolas"/>
         </w:rPr>
-        <w:t xml:space="preserve">Entropy: H(S) = -Σ p_i log2(p_i)</w:t>
+        <w:t>Entropy: H(S) = -Σ p_i log2(p_i)</w:t>
       </w:r>
     </w:p>
     <w:p>
@@ -308,7 +379,6 @@
         <w:spacing w:after="60"/>
       </w:pPr>
       <w:r>
-        <w:lastRenderedPageBreak/>
         <w:t>Requires little data preprocessing (no need for feature scaling)</w:t>
       </w:r>
     </w:p>
@@ -438,7 +508,20 @@
         <w:pStyle w:val="Heading1"/>
         <w:spacing w:before="300" w:after="150"/>
       </w:pPr>
-      <w:r>
+    </w:p>
+    <w:p>
+      <w:pPr>
+        <w:pStyle w:val="Heading1"/>
+        <w:spacing w:before="300" w:after="150"/>
+      </w:pPr>
+    </w:p>
+    <w:p>
+      <w:pPr>
+        <w:pStyle w:val="Heading1"/>
+        <w:spacing w:before="300" w:after="150"/>
+      </w:pPr>
+      <w:r>
+        <w:lastRenderedPageBreak/>
         <w:t>2. k-Nearest Neighbors (kNN)</w:t>
       </w:r>
     </w:p>
@@ -456,7 +539,78 @@
         <w:spacing w:after="120"/>
       </w:pPr>
       <w:r>
-        <w:t xml:space="preserve">kNN is a lazy, instance-based supervised learning algorithm used for classification and regression. It makes predictions based on the 'k' closest data points in the training set.</w:t>
+        <w:t>kNN is a lazy, instance-based supervised learning algorithm used for classification and regression. It makes predictions based on the 'k' closest data points in the training set.</w:t>
+      </w:r>
+    </w:p>
+    <w:p>
+      <w:pPr>
+        <w:spacing w:after="120"/>
+      </w:pPr>
+    </w:p>
+    <w:p>
+      <w:pPr>
+        <w:spacing w:after="120"/>
+        <w:jc w:val="center"/>
+      </w:pPr>
+      <w:r>
+        <w:rPr>
+          <w:noProof/>
+        </w:rPr>
+        <w:drawing>
+          <wp:inline distT="0" distB="0" distL="0" distR="0" wp14:anchorId="78CC85FD" wp14:editId="1F762770">
+            <wp:extent cx="4810125" cy="3467100"/>
+            <wp:effectExtent l="76200" t="76200" r="142875" b="133350"/>
+            <wp:docPr id="112762364" name="Picture 3"/>
+            <wp:cNvGraphicFramePr>
+              <a:graphicFrameLocks xmlns:a="http://schemas.openxmlformats.org/drawingml/2006/main" noChangeAspect="1"/>
+            </wp:cNvGraphicFramePr>
+            <a:graphic xmlns:a="http://schemas.openxmlformats.org/drawingml/2006/main">
+              <a:graphicData uri="http://schemas.openxmlformats.org/drawingml/2006/picture">
+                <pic:pic xmlns:pic="http://schemas.openxmlformats.org/drawingml/2006/picture">
+                  <pic:nvPicPr>
+                    <pic:cNvPr id="112762364" name="Picture 112762364"/>
+                    <pic:cNvPicPr/>
+                  </pic:nvPicPr>
+                  <pic:blipFill>
+                    <a:blip r:embed="rId8">
+                      <a:extLst>
+                        <a:ext uri="{28A0092B-C50C-407E-A947-70E740481C1C}">
+                          <a14:useLocalDpi xmlns:a14="http://schemas.microsoft.com/office/drawing/2010/main" val="0"/>
+                        </a:ext>
+                      </a:extLst>
+                    </a:blip>
+                    <a:stretch>
+                      <a:fillRect/>
+                    </a:stretch>
+                  </pic:blipFill>
+                  <pic:spPr>
+                    <a:xfrm>
+                      <a:off x="0" y="0"/>
+                      <a:ext cx="4810125" cy="3467100"/>
+                    </a:xfrm>
+                    <a:prstGeom prst="rect">
+                      <a:avLst/>
+                    </a:prstGeom>
+                    <a:ln w="38100" cap="sq">
+                      <a:solidFill>
+                        <a:srgbClr val="000000"/>
+                      </a:solidFill>
+                      <a:prstDash val="solid"/>
+                      <a:miter lim="800000"/>
+                    </a:ln>
+                    <a:effectLst>
+                      <a:outerShdw blurRad="50800" dist="38100" dir="2700000" algn="tl" rotWithShape="0">
+                        <a:srgbClr val="000000">
+                          <a:alpha val="43000"/>
+                        </a:srgbClr>
+                      </a:outerShdw>
+                    </a:effectLst>
+                  </pic:spPr>
+                </pic:pic>
+              </a:graphicData>
+            </a:graphic>
+          </wp:inline>
+        </w:drawing>
       </w:r>
     </w:p>
     <w:p>
@@ -551,7 +705,7 @@
         <w:rPr>
           <w:rFonts w:ascii="Consolas" w:eastAsia="Consolas" w:hAnsi="Consolas" w:cs="Consolas"/>
         </w:rPr>
-        <w:t xml:space="preserve">Euclidean Distance: d = √Σ(x_i - y_i)²</w:t>
+        <w:t>Euclidean Distance: d = √Σ(x_i - y_i)²</w:t>
       </w:r>
     </w:p>
     <w:p>
@@ -563,7 +717,7 @@
         <w:rPr>
           <w:rFonts w:ascii="Consolas" w:eastAsia="Consolas" w:hAnsi="Consolas" w:cs="Consolas"/>
         </w:rPr>
-        <w:t xml:space="preserve">Manhattan Distance: d = Σ|x_i - y_i|</w:t>
+        <w:t>Manhattan Distance: d = Σ|x_i - y_i|</w:t>
       </w:r>
     </w:p>
     <w:p>
@@ -628,6 +782,7 @@
         <w:spacing w:before="240" w:after="120"/>
       </w:pPr>
       <w:r>
+        <w:lastRenderedPageBreak/>
         <w:t>Advantages</w:t>
       </w:r>
     </w:p>
@@ -676,7 +831,6 @@
         <w:spacing w:before="240" w:after="120"/>
       </w:pPr>
       <w:r>
-        <w:lastRenderedPageBreak/>
         <w:t>Disadvantages</w:t>
       </w:r>
     </w:p>
@@ -817,6 +971,77 @@
       <w:r>
         <w:t>Naive Bayes is a probabilistic classifier based on Bayes' Theorem, with a "naive" assumption that all features are conditionally independent given the class label.</w:t>
       </w:r>
+      <w:r>
+        <w:t xml:space="preserve"> Its use in </w:t>
+      </w:r>
+      <w:r>
+        <w:t>Spam filtering, sentiment analysis, document/text classification, medical diagnosis</w:t>
+      </w:r>
+    </w:p>
+    <w:p>
+      <w:pPr>
+        <w:spacing w:after="120"/>
+      </w:pPr>
+      <w:r>
+        <w:rPr>
+          <w:noProof/>
+        </w:rPr>
+        <w:drawing>
+          <wp:inline distT="0" distB="0" distL="0" distR="0" wp14:anchorId="7A87896E" wp14:editId="2D18285E">
+            <wp:extent cx="5943600" cy="3009900"/>
+            <wp:effectExtent l="76200" t="76200" r="133350" b="133350"/>
+            <wp:docPr id="653846626" name="Picture 4"/>
+            <wp:cNvGraphicFramePr>
+              <a:graphicFrameLocks xmlns:a="http://schemas.openxmlformats.org/drawingml/2006/main" noChangeAspect="1"/>
+            </wp:cNvGraphicFramePr>
+            <a:graphic xmlns:a="http://schemas.openxmlformats.org/drawingml/2006/main">
+              <a:graphicData uri="http://schemas.openxmlformats.org/drawingml/2006/picture">
+                <pic:pic xmlns:pic="http://schemas.openxmlformats.org/drawingml/2006/picture">
+                  <pic:nvPicPr>
+                    <pic:cNvPr id="653846626" name="Picture 653846626"/>
+                    <pic:cNvPicPr/>
+                  </pic:nvPicPr>
+                  <pic:blipFill>
+                    <a:blip r:embed="rId9">
+                      <a:extLst>
+                        <a:ext uri="{28A0092B-C50C-407E-A947-70E740481C1C}">
+                          <a14:useLocalDpi xmlns:a14="http://schemas.microsoft.com/office/drawing/2010/main" val="0"/>
+                        </a:ext>
+                      </a:extLst>
+                    </a:blip>
+                    <a:stretch>
+                      <a:fillRect/>
+                    </a:stretch>
+                  </pic:blipFill>
+                  <pic:spPr>
+                    <a:xfrm>
+                      <a:off x="0" y="0"/>
+                      <a:ext cx="5943600" cy="3009900"/>
+                    </a:xfrm>
+                    <a:prstGeom prst="rect">
+                      <a:avLst/>
+                    </a:prstGeom>
+                    <a:ln w="38100" cap="sq">
+                      <a:solidFill>
+                        <a:srgbClr val="000000"/>
+                      </a:solidFill>
+                      <a:prstDash val="solid"/>
+                      <a:miter lim="800000"/>
+                    </a:ln>
+                    <a:effectLst>
+                      <a:outerShdw blurRad="50800" dist="38100" dir="2700000" algn="tl" rotWithShape="0">
+                        <a:srgbClr val="000000">
+                          <a:alpha val="43000"/>
+                        </a:srgbClr>
+                      </a:outerShdw>
+                    </a:effectLst>
+                  </pic:spPr>
+                </pic:pic>
+              </a:graphicData>
+            </a:graphic>
+          </wp:inline>
+        </w:drawing>
+      </w:r>
     </w:p>
     <w:p>
       <w:pPr>
@@ -824,6 +1049,7 @@
         <w:spacing w:before="240" w:after="120"/>
       </w:pPr>
       <w:r>
+        <w:lastRenderedPageBreak/>
         <w:t>Bayes' Theorem</w:t>
       </w:r>
     </w:p>
@@ -897,35 +1123,6 @@
       </w:pPr>
       <w:r>
         <w:t>P(X) = Evidence (normalizing constant)</w:t>
-      </w:r>
-    </w:p>
-    <w:p>
-      <w:pPr>
-        <w:pStyle w:val="Heading2"/>
-        <w:spacing w:before="240" w:after="120"/>
-      </w:pPr>
-      <w:r>
-        <w:t>Naive Independence Assumption</w:t>
-      </w:r>
-    </w:p>
-    <w:p>
-      <w:pPr>
-        <w:shd w:val="clear" w:color="auto" w:fill="F2F2F2"/>
-        <w:spacing w:after="120"/>
-      </w:pPr>
-      <w:r>
-        <w:rPr>
-          <w:rFonts w:ascii="Consolas" w:eastAsia="Consolas" w:hAnsi="Consolas" w:cs="Consolas"/>
-        </w:rPr>
-        <w:t>P(X|C) = P(x1|C) * P(x2|C) * ... * P(xn|C)</w:t>
-      </w:r>
-    </w:p>
-    <w:p>
-      <w:pPr>
-        <w:spacing w:after="120"/>
-      </w:pPr>
-      <w:r>
-        <w:t>This simplifies computation significantly, even though the independence assumption rarely holds perfectly in real data.</w:t>
       </w:r>
     </w:p>
     <w:p>
@@ -959,13 +1156,8 @@
         <w:gridCol w:w="4680"/>
       </w:tblGrid>
       <w:tr>
-        <w:tblPrEx>
-          <w:tblCellMar>
-            <w:top w:w="0" w:type="dxa"/>
-            <w:bottom w:w="0" w:type="dxa"/>
-          </w:tblCellMar>
-        </w:tblPrEx>
         <w:trPr>
+          <w:trHeight w:val="350"/>
           <w:tblHeader/>
         </w:trPr>
         <w:tc>
@@ -974,6 +1166,9 @@
             <w:shd w:val="clear" w:color="auto" w:fill="2E5395"/>
           </w:tcPr>
           <w:p>
+            <w:pPr>
+              <w:jc w:val="center"/>
+            </w:pPr>
             <w:r>
               <w:rPr>
                 <w:b/>
@@ -990,6 +1185,9 @@
             <w:shd w:val="clear" w:color="auto" w:fill="2E5395"/>
           </w:tcPr>
           <w:p>
+            <w:pPr>
+              <w:jc w:val="center"/>
+            </w:pPr>
             <w:r>
               <w:rPr>
                 <w:b/>
@@ -1002,17 +1200,17 @@
         </w:tc>
       </w:tr>
       <w:tr>
-        <w:tblPrEx>
-          <w:tblCellMar>
-            <w:top w:w="0" w:type="dxa"/>
-            <w:bottom w:w="0" w:type="dxa"/>
-          </w:tblCellMar>
-        </w:tblPrEx>
+        <w:trPr>
+          <w:trHeight w:val="269"/>
+        </w:trPr>
         <w:tc>
           <w:tcPr>
             <w:tcW w:w="4680" w:type="dxa"/>
           </w:tcPr>
           <w:p>
+            <w:pPr>
+              <w:jc w:val="center"/>
+            </w:pPr>
             <w:r>
               <w:t>Gaussian NB</w:t>
             </w:r>
@@ -1023,6 +1221,9 @@
             <w:tcW w:w="4680" w:type="dxa"/>
           </w:tcPr>
           <w:p>
+            <w:pPr>
+              <w:jc w:val="center"/>
+            </w:pPr>
             <w:r>
               <w:t>Continuous features (assumes normal distribution)</w:t>
             </w:r>
@@ -1030,18 +1231,18 @@
         </w:tc>
       </w:tr>
       <w:tr>
-        <w:tblPrEx>
-          <w:tblCellMar>
-            <w:top w:w="0" w:type="dxa"/>
-            <w:bottom w:w="0" w:type="dxa"/>
-          </w:tblCellMar>
-        </w:tblPrEx>
+        <w:trPr>
+          <w:trHeight w:val="251"/>
+        </w:trPr>
         <w:tc>
           <w:tcPr>
             <w:tcW w:w="4680" w:type="dxa"/>
             <w:shd w:val="clear" w:color="auto" w:fill="F2F6FC"/>
           </w:tcPr>
           <w:p>
+            <w:pPr>
+              <w:jc w:val="center"/>
+            </w:pPr>
             <w:r>
               <w:t>Multinomial NB</w:t>
             </w:r>
@@ -1053,6 +1254,9 @@
             <w:shd w:val="clear" w:color="auto" w:fill="F2F6FC"/>
           </w:tcPr>
           <w:p>
+            <w:pPr>
+              <w:jc w:val="center"/>
+            </w:pPr>
             <w:r>
               <w:t>Discrete counts (e.g., word counts in text classification)</w:t>
             </w:r>
@@ -1060,17 +1264,17 @@
         </w:tc>
       </w:tr>
       <w:tr>
-        <w:tblPrEx>
-          <w:tblCellMar>
-            <w:top w:w="0" w:type="dxa"/>
-            <w:bottom w:w="0" w:type="dxa"/>
-          </w:tblCellMar>
-        </w:tblPrEx>
+        <w:trPr>
+          <w:trHeight w:val="170"/>
+        </w:trPr>
         <w:tc>
           <w:tcPr>
             <w:tcW w:w="4680" w:type="dxa"/>
           </w:tcPr>
           <w:p>
+            <w:pPr>
+              <w:jc w:val="center"/>
+            </w:pPr>
             <w:r>
               <w:t>Bernoulli NB</w:t>
             </w:r>
@@ -1081,8 +1285,11 @@
             <w:tcW w:w="4680" w:type="dxa"/>
           </w:tcPr>
           <w:p>
-            <w:r>
-              <w:t xml:space="preserve">Binary/boolean features (e.g., word presence/absence)</w:t>
+            <w:pPr>
+              <w:jc w:val="center"/>
+            </w:pPr>
+            <w:r>
+              <w:t>Binary/boolean features (e.g., word presence/absence)</w:t>
             </w:r>
           </w:p>
         </w:tc>
@@ -1091,6 +1298,11 @@
     <w:p>
       <w:pPr>
         <w:spacing w:after="200"/>
+        <w:jc w:val="center"/>
+        <w:rPr>
+          <w:sz w:val="6"/>
+          <w:szCs w:val="6"/>
+        </w:rPr>
       </w:pPr>
     </w:p>
     <w:p>
@@ -1138,21 +1350,7 @@
         <w:spacing w:after="60"/>
       </w:pPr>
       <w:r>
-        <w:lastRenderedPageBreak/>
         <w:t>Requires relatively small training data</w:t>
-      </w:r>
-    </w:p>
-    <w:p>
-      <w:pPr>
-        <w:pStyle w:val="ListParagraph"/>
-        <w:numPr>
-          <w:ilvl w:val="0"/>
-          <w:numId w:val="2"/>
-        </w:numPr>
-        <w:spacing w:after="60"/>
-      </w:pPr>
-      <w:r>
-        <w:t>Performs well even when independence assumption is violated</w:t>
       </w:r>
     </w:p>
     <w:p>
@@ -1194,19 +1392,6 @@
       <w:pPr>
         <w:pStyle w:val="ListParagraph"/>
         <w:numPr>
-          <w:ilvl w:val="1"/>
-          <w:numId w:val="2"/>
-        </w:numPr>
-        <w:spacing w:after="60"/>
-      </w:pPr>
-      <w:r>
-        <w:t>Solved using Laplace (Additive) Smoothing: P(x|C) = (count(x,C) + 1) / (count(C) + n)</w:t>
-      </w:r>
-    </w:p>
-    <w:p>
-      <w:pPr>
-        <w:pStyle w:val="ListParagraph"/>
-        <w:numPr>
           <w:ilvl w:val="0"/>
           <w:numId w:val="2"/>
         </w:numPr>
@@ -1222,6 +1407,497 @@
         <w:spacing w:before="240" w:after="120"/>
       </w:pPr>
       <w:r>
+        <w:t>4. Train/Test Split and Cross-Validation</w:t>
+      </w:r>
+    </w:p>
+    <w:p>
+      <w:pPr>
+        <w:pStyle w:val="Heading2"/>
+        <w:spacing w:before="240" w:after="120"/>
+      </w:pPr>
+      <w:r>
+        <w:t>Concept</w:t>
+      </w:r>
+    </w:p>
+    <w:p>
+      <w:pPr>
+        <w:spacing w:after="120"/>
+      </w:pPr>
+      <w:r>
+        <w:t>Train/Test Split and Cross-Validation are model evaluation techniques used to estimate how well a machine learning model will generalize to unseen data, and to guard against overfitting to the training set.</w:t>
+      </w:r>
+    </w:p>
+    <w:p>
+      <w:pPr>
+        <w:pStyle w:val="Strong1"/>
+      </w:pPr>
+      <w:r>
+        <w:rPr>
+          <w:noProof/>
+        </w:rPr>
+        <w:drawing>
+          <wp:inline distT="0" distB="0" distL="0" distR="0" wp14:anchorId="1233EA6E" wp14:editId="32180B1B">
+            <wp:extent cx="5936500" cy="2370117"/>
+            <wp:effectExtent l="76200" t="76200" r="140970" b="125730"/>
+            <wp:docPr id="1213846483" name="Picture 5"/>
+            <wp:cNvGraphicFramePr>
+              <a:graphicFrameLocks xmlns:a="http://schemas.openxmlformats.org/drawingml/2006/main" noChangeAspect="1"/>
+            </wp:cNvGraphicFramePr>
+            <a:graphic xmlns:a="http://schemas.openxmlformats.org/drawingml/2006/main">
+              <a:graphicData uri="http://schemas.openxmlformats.org/drawingml/2006/picture">
+                <pic:pic xmlns:pic="http://schemas.openxmlformats.org/drawingml/2006/picture">
+                  <pic:nvPicPr>
+                    <pic:cNvPr id="1213846483" name="Picture 1213846483"/>
+                    <pic:cNvPicPr/>
+                  </pic:nvPicPr>
+                  <pic:blipFill>
+                    <a:blip r:embed="rId10">
+                      <a:extLst>
+                        <a:ext uri="{28A0092B-C50C-407E-A947-70E740481C1C}">
+                          <a14:useLocalDpi xmlns:a14="http://schemas.microsoft.com/office/drawing/2010/main" val="0"/>
+                        </a:ext>
+                      </a:extLst>
+                    </a:blip>
+                    <a:stretch>
+                      <a:fillRect/>
+                    </a:stretch>
+                  </pic:blipFill>
+                  <pic:spPr>
+                    <a:xfrm>
+                      <a:off x="0" y="0"/>
+                      <a:ext cx="6055184" cy="2417501"/>
+                    </a:xfrm>
+                    <a:prstGeom prst="rect">
+                      <a:avLst/>
+                    </a:prstGeom>
+                    <a:ln w="38100" cap="sq">
+                      <a:solidFill>
+                        <a:srgbClr val="000000"/>
+                      </a:solidFill>
+                      <a:prstDash val="solid"/>
+                      <a:miter lim="800000"/>
+                    </a:ln>
+                    <a:effectLst>
+                      <a:outerShdw blurRad="50800" dist="38100" dir="2700000" algn="tl" rotWithShape="0">
+                        <a:srgbClr val="000000">
+                          <a:alpha val="43000"/>
+                        </a:srgbClr>
+                      </a:outerShdw>
+                    </a:effectLst>
+                  </pic:spPr>
+                </pic:pic>
+              </a:graphicData>
+            </a:graphic>
+          </wp:inline>
+        </w:drawing>
+      </w:r>
+    </w:p>
+    <w:p>
+      <w:pPr>
+        <w:pStyle w:val="Heading2"/>
+        <w:spacing w:before="240" w:after="120"/>
+      </w:pPr>
+      <w:r>
+        <w:lastRenderedPageBreak/>
+        <w:t>Train/Test Split</w:t>
+      </w:r>
+    </w:p>
+    <w:p>
+      <w:pPr>
+        <w:spacing w:after="120"/>
+      </w:pPr>
+      <w:r>
+        <w:t>The dataset is divided into two subsets: a training set used to fit the model, and a test set held back to evaluate its performance on unseen data.</w:t>
+      </w:r>
+    </w:p>
+    <w:p>
+      <w:pPr>
+        <w:pStyle w:val="ListParagraph"/>
+        <w:numPr>
+          <w:ilvl w:val="0"/>
+          <w:numId w:val="2"/>
+        </w:numPr>
+        <w:spacing w:after="60"/>
+      </w:pPr>
+      <w:r>
+        <w:t>Common split ratios: 70/30, 80/20, or 90/10, depending on dataset size</w:t>
+      </w:r>
+    </w:p>
+    <w:p>
+      <w:pPr>
+        <w:pStyle w:val="ListParagraph"/>
+        <w:numPr>
+          <w:ilvl w:val="0"/>
+          <w:numId w:val="2"/>
+        </w:numPr>
+        <w:spacing w:after="60"/>
+      </w:pPr>
+      <w:r>
+        <w:t>Splitting should be randomized to avoid ordering bias</w:t>
+      </w:r>
+    </w:p>
+    <w:p>
+      <w:pPr>
+        <w:pStyle w:val="ListParagraph"/>
+        <w:numPr>
+          <w:ilvl w:val="0"/>
+          <w:numId w:val="2"/>
+        </w:numPr>
+        <w:spacing w:after="60"/>
+      </w:pPr>
+      <w:r>
+        <w:t>A larger training set improves model fit; a larger test set gives a more reliable performance estimate</w:t>
+      </w:r>
+    </w:p>
+    <w:p>
+      <w:pPr>
+        <w:pStyle w:val="Heading2"/>
+        <w:spacing w:before="240" w:after="120"/>
+      </w:pPr>
+      <w:r>
+        <w:t>Cross-Validation</w:t>
+      </w:r>
+    </w:p>
+    <w:p>
+      <w:pPr>
+        <w:spacing w:after="120"/>
+      </w:pPr>
+      <w:r>
+        <w:t>Cross-validation extends the train/test split idea by repeatedly partitioning the data, so every observation gets a chance to be used for both training and testing.</w:t>
+      </w:r>
+    </w:p>
+    <w:p>
+      <w:pPr>
+        <w:pStyle w:val="Heading2"/>
+        <w:spacing w:before="240" w:after="120"/>
+      </w:pPr>
+      <w:r>
+        <w:t>k-Fold Cross-Validation</w:t>
+      </w:r>
+    </w:p>
+    <w:p>
+      <w:pPr>
+        <w:spacing w:after="120"/>
+      </w:pPr>
+      <w:r>
+        <w:t>The dataset is divided into k equally sized folds. The model is trained on k-1 folds and tested on the remaining fold; this is repeated k times so each fold serves as the test set once. The final performance is the average across all k runs.</w:t>
+      </w:r>
+    </w:p>
+    <w:p>
+      <w:pPr>
+        <w:pStyle w:val="ListParagraph"/>
+        <w:numPr>
+          <w:ilvl w:val="0"/>
+          <w:numId w:val="2"/>
+        </w:numPr>
+        <w:spacing w:after="60"/>
+      </w:pPr>
+      <w:r>
+        <w:t>Typical values: k = 5 or k = 10</w:t>
+      </w:r>
+    </w:p>
+    <w:p>
+      <w:pPr>
+        <w:pStyle w:val="ListParagraph"/>
+        <w:numPr>
+          <w:ilvl w:val="0"/>
+          <w:numId w:val="2"/>
+        </w:numPr>
+        <w:spacing w:after="60"/>
+      </w:pPr>
+      <w:r>
+        <w:t>Reduces the impact of any single, potentially unrepresentative, train/test split</w:t>
+      </w:r>
+    </w:p>
+    <w:p>
+      <w:pPr>
+        <w:pStyle w:val="Heading2"/>
+        <w:spacing w:before="240" w:after="120"/>
+      </w:pPr>
+      <w:r>
+        <w:t>Stratified k-Fold</w:t>
+      </w:r>
+    </w:p>
+    <w:p>
+      <w:pPr>
+        <w:spacing w:after="120"/>
+      </w:pPr>
+      <w:r>
+        <w:t>A variant of k-fold cross-validation that preserves the class distribution within each fold, which is especially important for imbalanced classification problems.</w:t>
+      </w:r>
+    </w:p>
+    <w:p>
+      <w:pPr>
+        <w:pStyle w:val="Heading2"/>
+        <w:spacing w:before="240" w:after="120"/>
+      </w:pPr>
+      <w:r>
+        <w:t>Leave-One-Out Cross-Validation (LOOCV)</w:t>
+      </w:r>
+    </w:p>
+    <w:p>
+      <w:pPr>
+        <w:spacing w:after="120"/>
+      </w:pPr>
+      <w:r>
+        <w:t>A special case of k-fold cross-validation where k equals the number of samples (n). Each observation is used once as the test set while the rest form the training set.</w:t>
+      </w:r>
+    </w:p>
+    <w:p>
+      <w:pPr>
+        <w:pStyle w:val="ListParagraph"/>
+        <w:numPr>
+          <w:ilvl w:val="0"/>
+          <w:numId w:val="2"/>
+        </w:numPr>
+        <w:spacing w:after="60"/>
+      </w:pPr>
+      <w:r>
+        <w:t>Makes maximal use of the available data</w:t>
+      </w:r>
+    </w:p>
+    <w:p>
+      <w:pPr>
+        <w:pStyle w:val="ListParagraph"/>
+        <w:numPr>
+          <w:ilvl w:val="0"/>
+          <w:numId w:val="2"/>
+        </w:numPr>
+        <w:spacing w:after="60"/>
+      </w:pPr>
+      <w:r>
+        <w:t>Computationally expensive for large datasets, since the model is trained n times</w:t>
+      </w:r>
+    </w:p>
+    <w:p>
+      <w:pPr>
+        <w:spacing w:after="60"/>
+      </w:pPr>
+      <w:r>
+        <w:rPr>
+          <w:noProof/>
+        </w:rPr>
+        <w:drawing>
+          <wp:inline distT="0" distB="0" distL="0" distR="0" wp14:anchorId="46449D22" wp14:editId="37602F53">
+            <wp:extent cx="5942965" cy="3000375"/>
+            <wp:effectExtent l="76200" t="76200" r="133985" b="142875"/>
+            <wp:docPr id="2084326527" name="Picture 7"/>
+            <wp:cNvGraphicFramePr>
+              <a:graphicFrameLocks xmlns:a="http://schemas.openxmlformats.org/drawingml/2006/main" noChangeAspect="1"/>
+            </wp:cNvGraphicFramePr>
+            <a:graphic xmlns:a="http://schemas.openxmlformats.org/drawingml/2006/main">
+              <a:graphicData uri="http://schemas.openxmlformats.org/drawingml/2006/picture">
+                <pic:pic xmlns:pic="http://schemas.openxmlformats.org/drawingml/2006/picture">
+                  <pic:nvPicPr>
+                    <pic:cNvPr id="2084326527" name="Picture 2084326527"/>
+                    <pic:cNvPicPr/>
+                  </pic:nvPicPr>
+                  <pic:blipFill>
+                    <a:blip r:embed="rId11">
+                      <a:extLst>
+                        <a:ext uri="{28A0092B-C50C-407E-A947-70E740481C1C}">
+                          <a14:useLocalDpi xmlns:a14="http://schemas.microsoft.com/office/drawing/2010/main" val="0"/>
+                        </a:ext>
+                      </a:extLst>
+                    </a:blip>
+                    <a:stretch>
+                      <a:fillRect/>
+                    </a:stretch>
+                  </pic:blipFill>
+                  <pic:spPr>
+                    <a:xfrm>
+                      <a:off x="0" y="0"/>
+                      <a:ext cx="5947572" cy="3002701"/>
+                    </a:xfrm>
+                    <a:prstGeom prst="rect">
+                      <a:avLst/>
+                    </a:prstGeom>
+                    <a:ln w="38100" cap="sq">
+                      <a:solidFill>
+                        <a:srgbClr val="000000"/>
+                      </a:solidFill>
+                      <a:prstDash val="solid"/>
+                      <a:miter lim="800000"/>
+                    </a:ln>
+                    <a:effectLst>
+                      <a:outerShdw blurRad="50800" dist="38100" dir="2700000" algn="tl" rotWithShape="0">
+                        <a:srgbClr val="000000">
+                          <a:alpha val="43000"/>
+                        </a:srgbClr>
+                      </a:outerShdw>
+                    </a:effectLst>
+                  </pic:spPr>
+                </pic:pic>
+              </a:graphicData>
+            </a:graphic>
+          </wp:inline>
+        </w:drawing>
+      </w:r>
+    </w:p>
+    <w:p>
+      <w:pPr>
+        <w:pStyle w:val="Heading2"/>
+        <w:spacing w:before="240" w:after="120"/>
+      </w:pPr>
+      <w:r>
+        <w:lastRenderedPageBreak/>
+        <w:t>Why Use Cross-Validation</w:t>
+      </w:r>
+    </w:p>
+    <w:p>
+      <w:pPr>
+        <w:pStyle w:val="ListParagraph"/>
+        <w:numPr>
+          <w:ilvl w:val="0"/>
+          <w:numId w:val="2"/>
+        </w:numPr>
+        <w:spacing w:after="60"/>
+      </w:pPr>
+      <w:r>
+        <w:t>Gives a more reliable estimate of model performance than a single train/test split</w:t>
+      </w:r>
+    </w:p>
+    <w:p>
+      <w:pPr>
+        <w:pStyle w:val="ListParagraph"/>
+        <w:numPr>
+          <w:ilvl w:val="0"/>
+          <w:numId w:val="2"/>
+        </w:numPr>
+        <w:spacing w:after="60"/>
+      </w:pPr>
+      <w:r>
+        <w:t>Reduces variance caused by a particularly lucky or unlucky split</w:t>
+      </w:r>
+    </w:p>
+    <w:p>
+      <w:pPr>
+        <w:pStyle w:val="ListParagraph"/>
+        <w:numPr>
+          <w:ilvl w:val="0"/>
+          <w:numId w:val="2"/>
+        </w:numPr>
+        <w:spacing w:after="60"/>
+      </w:pPr>
+      <w:r>
+        <w:t>Makes efficient use of limited data, since every sample is used for both training and testing</w:t>
+      </w:r>
+    </w:p>
+    <w:p>
+      <w:pPr>
+        <w:pStyle w:val="ListParagraph"/>
+        <w:numPr>
+          <w:ilvl w:val="0"/>
+          <w:numId w:val="2"/>
+        </w:numPr>
+        <w:spacing w:after="60"/>
+      </w:pPr>
+      <w:r>
+        <w:t>Commonly used for model selection and hyperparameter tuning (e.g., choosing k in kNN)</w:t>
+      </w:r>
+    </w:p>
+    <w:p>
+      <w:pPr>
+        <w:pStyle w:val="Heading2"/>
+        <w:spacing w:before="240" w:after="120"/>
+      </w:pPr>
+      <w:r>
+        <w:t>Advantages</w:t>
+      </w:r>
+    </w:p>
+    <w:p>
+      <w:pPr>
+        <w:pStyle w:val="ListParagraph"/>
+        <w:numPr>
+          <w:ilvl w:val="0"/>
+          <w:numId w:val="2"/>
+        </w:numPr>
+        <w:spacing w:after="60"/>
+      </w:pPr>
+      <w:r>
+        <w:t>More robust and less biased estimate of model performance</w:t>
+      </w:r>
+    </w:p>
+    <w:p>
+      <w:pPr>
+        <w:pStyle w:val="ListParagraph"/>
+        <w:numPr>
+          <w:ilvl w:val="0"/>
+          <w:numId w:val="2"/>
+        </w:numPr>
+        <w:spacing w:after="60"/>
+      </w:pPr>
+      <w:r>
+        <w:t>Helps detect overfitting before deployment</w:t>
+      </w:r>
+    </w:p>
+    <w:p>
+      <w:pPr>
+        <w:pStyle w:val="ListParagraph"/>
+        <w:numPr>
+          <w:ilvl w:val="0"/>
+          <w:numId w:val="2"/>
+        </w:numPr>
+        <w:spacing w:after="60"/>
+      </w:pPr>
+      <w:r>
+        <w:t>Makes better use of small datasets compared to a single fixed split</w:t>
+      </w:r>
+    </w:p>
+    <w:p>
+      <w:pPr>
+        <w:pStyle w:val="Heading2"/>
+        <w:spacing w:before="240" w:after="120"/>
+      </w:pPr>
+      <w:r>
+        <w:t>Disadvantages</w:t>
+      </w:r>
+    </w:p>
+    <w:p>
+      <w:pPr>
+        <w:pStyle w:val="ListParagraph"/>
+        <w:numPr>
+          <w:ilvl w:val="0"/>
+          <w:numId w:val="2"/>
+        </w:numPr>
+        <w:spacing w:after="60"/>
+      </w:pPr>
+      <w:r>
+        <w:t>More computationally expensive than a single train/test split, especially for large k or LOOCV</w:t>
+      </w:r>
+    </w:p>
+    <w:p>
+      <w:pPr>
+        <w:pStyle w:val="ListParagraph"/>
+        <w:numPr>
+          <w:ilvl w:val="0"/>
+          <w:numId w:val="2"/>
+        </w:numPr>
+        <w:spacing w:after="60"/>
+      </w:pPr>
+      <w:r>
+        <w:t>Not ideal for time-series data unless using time-aware variants (e.g., rolling/expanding window validation)</w:t>
+      </w:r>
+    </w:p>
+    <w:p>
+      <w:pPr>
+        <w:pStyle w:val="ListParagraph"/>
+        <w:numPr>
+          <w:ilvl w:val="0"/>
+          <w:numId w:val="2"/>
+        </w:numPr>
+        <w:spacing w:after="60"/>
+      </w:pPr>
+      <w:r>
+        <w:t>Results can still vary depending on how folds are constructed</w:t>
+      </w:r>
+    </w:p>
+    <w:p>
+      <w:pPr>
+        <w:pStyle w:val="Heading2"/>
+        <w:spacing w:before="240" w:after="120"/>
+      </w:pPr>
+      <w:r>
         <w:t>Use Cases</w:t>
       </w:r>
     </w:p>
@@ -1230,8 +1906,16 @@
         <w:spacing w:after="120"/>
       </w:pPr>
       <w:r>
-        <w:t>Spam filtering, sentiment analysis, document/text classification, medical diagnosis</w:t>
-      </w:r>
+        <w:t>Model evaluation, hyperparameter tuning, comparing algorithms, and validating models before deployment in any supervised learning task.</w:t>
+      </w:r>
+    </w:p>
+    <w:p>
+      <w:pPr>
+        <w:pBdr>
+          <w:bottom w:val="single" w:sz="6" w:space="4" w:color="999999"/>
+        </w:pBdr>
+        <w:spacing w:after="200"/>
+      </w:pPr>
     </w:p>
     <w:p>
       <w:pPr>
@@ -1239,7 +1923,61 @@
         <w:spacing w:before="300" w:after="150"/>
       </w:pPr>
       <w:r>
-        <w:t>4. Train/Test Split and Cross-Validation</w:t>
+        <w:t>5. Feature Scaling, Handling Missing Data, and Encoding Categorical Features</w:t>
+      </w:r>
+    </w:p>
+    <w:p>
+      <w:pPr>
+        <w:spacing w:after="120"/>
+      </w:pPr>
+      <w:r>
+        <w:t>Before feeding data into a machine learning model, raw data almost always needs preprocessing. Three of the most common preprocessing steps are scaling numeric features, dealing with missing values, and converting categorical (non-numeric) features into a numeric form the model can use.</w:t>
+      </w:r>
+    </w:p>
+    <w:p>
+      <w:pPr>
+        <w:spacing w:after="150"/>
+        <w:jc w:val="center"/>
+      </w:pPr>
+      <w:r>
+        <w:rPr>
+          <w:noProof/>
+        </w:rPr>
+        <w:drawing>
+          <wp:inline distT="0" distB="0" distL="0" distR="0" wp14:anchorId="1A2B3C4D" wp14:editId="1A2B3C4E">
+            <wp:extent cx="5669280" cy="2002438"/>
+            <wp:effectExtent l="0" t="0" r="0" b="0"/>
+            <wp:docPr id="1" name="Picture 1" descr="Data preprocessing pipeline: raw dataset, handle missing data, encode categorical features, feature scaling, model-ready data"/>
+            <wp:cNvGraphicFramePr>
+              <a:graphicFrameLocks xmlns:a="http://schemas.openxmlformats.org/drawingml/2006/main" noChangeAspect="1"/>
+            </wp:cNvGraphicFramePr>
+            <a:graphic xmlns:a="http://schemas.openxmlformats.org/drawingml/2006/main">
+              <a:graphicData uri="http://schemas.openxmlformats.org/drawingml/2006/picture">
+                <pic:pic xmlns:pic="http://schemas.openxmlformats.org/drawingml/2006/picture">
+                  <pic:nvPicPr>
+                    <pic:cNvPr id="1" name="Picture 1"/>
+                    <pic:cNvPicPr/>
+                  </pic:nvPicPr>
+                  <pic:blipFill>
+                    <a:blip r:embed="rId12"/>
+                    <a:stretch>
+                      <a:fillRect/>
+                    </a:stretch>
+                  </pic:blipFill>
+                  <pic:spPr>
+                    <a:xfrm>
+                      <a:off x="0" y="0"/>
+                      <a:ext cx="5669280" cy="2002438"/>
+                    </a:xfrm>
+                    <a:prstGeom prst="rect">
+                      <a:avLst/>
+                    </a:prstGeom>
+                  </pic:spPr>
+                </pic:pic>
+              </a:graphicData>
+            </a:graphic>
+          </wp:inline>
+        </w:drawing>
       </w:r>
     </w:p>
     <w:p>
@@ -1248,7 +1986,7 @@
         <w:spacing w:before="240" w:after="120"/>
       </w:pPr>
       <w:r>
-        <w:t>Concept</w:t>
+        <w:t>Feature Scaling</w:t>
       </w:r>
     </w:p>
     <w:p>
@@ -1256,7 +1994,114 @@
         <w:spacing w:after="120"/>
       </w:pPr>
       <w:r>
-        <w:t>Train/Test Split and Cross-Validation are model evaluation techniques used to estimate how well a machine learning model will generalize to unseen data, and to guard against overfitting to the training set.</w:t>
+        <w:t>Feature scaling brings numeric features onto a comparable range. Many algorithms (kNN, gradient descent-based models, SVMs, PCA) are distance- or gradient-based, so features with larger numeric ranges can dominate the result unless all features are scaled similarly.</w:t>
+      </w:r>
+    </w:p>
+    <w:p>
+      <w:pPr>
+        <w:pStyle w:val="Heading3"/>
+        <w:spacing w:before="200" w:after="100"/>
+      </w:pPr>
+      <w:r>
+        <w:lastRenderedPageBreak/>
+        <w:t>Min-Max Normalization</w:t>
+      </w:r>
+    </w:p>
+    <w:p>
+      <w:pPr>
+        <w:shd w:val="clear" w:color="auto" w:fill="F2F2F2"/>
+        <w:spacing w:after="120"/>
+      </w:pPr>
+      <w:r>
+        <w:rPr>
+          <w:rFonts w:ascii="Consolas" w:eastAsia="Consolas" w:hAnsi="Consolas" w:cs="Consolas"/>
+        </w:rPr>
+        <w:t>X_scaled = (X - X_min) / (X_max - X_min)</w:t>
+      </w:r>
+    </w:p>
+    <w:p>
+      <w:pPr>
+        <w:spacing w:after="120"/>
+      </w:pPr>
+      <w:r>
+        <w:t>Rescales values into a fixed range, usually [0, 1]. Sensitive to outliers, since a single extreme value stretches the whole range.</w:t>
+      </w:r>
+    </w:p>
+    <w:p>
+      <w:pPr>
+        <w:pStyle w:val="Heading3"/>
+        <w:spacing w:before="200" w:after="100"/>
+      </w:pPr>
+      <w:r>
+        <w:t>Standardization (Z-score / StandardScaler)</w:t>
+      </w:r>
+    </w:p>
+    <w:p>
+      <w:pPr>
+        <w:shd w:val="clear" w:color="auto" w:fill="F2F2F2"/>
+        <w:spacing w:after="120"/>
+      </w:pPr>
+      <w:r>
+        <w:rPr>
+          <w:rFonts w:ascii="Consolas" w:eastAsia="Consolas" w:hAnsi="Consolas" w:cs="Consolas"/>
+        </w:rPr>
+        <w:t>X_scaled = (X - μ) / σ</w:t>
+      </w:r>
+    </w:p>
+    <w:p>
+      <w:pPr>
+        <w:spacing w:after="120"/>
+      </w:pPr>
+      <w:r>
+        <w:t>Rescales features to have mean 0 and standard deviation 1. Implemented in scikit-learn as StandardScaler. Less sensitive to outliers than min-max scaling, and is the default choice for most distance-based and gradient-based algorithms.</w:t>
+      </w:r>
+    </w:p>
+    <w:p>
+      <w:pPr>
+        <w:pStyle w:val="Heading3"/>
+        <w:spacing w:before="200" w:after="100"/>
+      </w:pPr>
+      <w:r>
+        <w:t>When It Matters</w:t>
+      </w:r>
+    </w:p>
+    <w:p>
+      <w:pPr>
+        <w:pStyle w:val="ListParagraph"/>
+        <w:numPr>
+          <w:ilvl w:val="0"/>
+          <w:numId w:val="2"/>
+        </w:numPr>
+        <w:spacing w:after="60"/>
+      </w:pPr>
+      <w:r>
+        <w:t>Needed for: kNN, k-Means, SVM, PCA, logistic/linear regression with gradient descent, neural networks</w:t>
+      </w:r>
+    </w:p>
+    <w:p>
+      <w:pPr>
+        <w:pStyle w:val="ListParagraph"/>
+        <w:numPr>
+          <w:ilvl w:val="0"/>
+          <w:numId w:val="2"/>
+        </w:numPr>
+        <w:spacing w:after="60"/>
+      </w:pPr>
+      <w:r>
+        <w:t>Not needed for: tree-based models (Decision Trees, Random Forest, Gradient Boosting) and Naive Bayes, since they are not distance- or gradient-based</w:t>
+      </w:r>
+    </w:p>
+    <w:p>
+      <w:pPr>
+        <w:pStyle w:val="ListParagraph"/>
+        <w:numPr>
+          <w:ilvl w:val="0"/>
+          <w:numId w:val="2"/>
+        </w:numPr>
+        <w:spacing w:after="60"/>
+      </w:pPr>
+      <w:r>
+        <w:t>Scaler should always be fit on the training set only, then used to transform both train and test sets (never fit on the full dataset, to avoid data leakage)</w:t>
       </w:r>
     </w:p>
     <w:p>
@@ -1265,7 +2110,7 @@
         <w:spacing w:before="240" w:after="120"/>
       </w:pPr>
       <w:r>
-        <w:t>Train/Test Split</w:t>
+        <w:t>Handling Missing Data</w:t>
       </w:r>
     </w:p>
     <w:p>
@@ -1273,60 +2118,303 @@
         <w:spacing w:after="120"/>
       </w:pPr>
       <w:r>
-        <w:t>The dataset is divided into two subsets: a training set used to fit the model, and a test set held back to evaluate its performance on unseen data.</w:t>
-      </w:r>
-    </w:p>
-    <w:p>
-      <w:pPr>
-        <w:pStyle w:val="ListParagraph"/>
-        <w:numPr>
-          <w:ilvl w:val="0"/>
-          <w:numId w:val="2"/>
-        </w:numPr>
-        <w:spacing w:after="60"/>
-      </w:pPr>
-      <w:r>
-        <w:t>Common split ratios: 70/30, 80/20, or 90/10, depending on dataset size</w:t>
-      </w:r>
-    </w:p>
-    <w:p>
-      <w:pPr>
-        <w:pStyle w:val="ListParagraph"/>
-        <w:numPr>
-          <w:ilvl w:val="0"/>
-          <w:numId w:val="2"/>
-        </w:numPr>
-        <w:spacing w:after="60"/>
-      </w:pPr>
-      <w:r>
-        <w:t>Splitting should be randomized to avoid ordering bias</w:t>
-      </w:r>
-    </w:p>
-    <w:p>
-      <w:pPr>
-        <w:pStyle w:val="ListParagraph"/>
-        <w:numPr>
-          <w:ilvl w:val="0"/>
-          <w:numId w:val="2"/>
-        </w:numPr>
-        <w:spacing w:after="60"/>
-      </w:pPr>
-      <w:r>
-        <w:t>Stratified splitting preserves class proportions and is important for classification tasks, especially with imbalanced data</w:t>
-      </w:r>
-    </w:p>
-    <w:p>
-      <w:pPr>
-        <w:pStyle w:val="ListParagraph"/>
-        <w:numPr>
-          <w:ilvl w:val="0"/>
-          <w:numId w:val="2"/>
-        </w:numPr>
-        <w:spacing w:after="60"/>
-      </w:pPr>
-      <w:r>
-        <w:t>A larger training set improves model fit; a larger test set gives a more reliable performance estimate</w:t>
-      </w:r>
+        <w:t>Real-world datasets almost always have missing values (NaN/null entries), which most algorithms cannot handle directly. The right strategy depends mainly on how much data is missing.</w:t>
+      </w:r>
+    </w:p>
+    <w:p>
+      <w:pPr>
+        <w:spacing w:after="120"/>
+      </w:pPr>
+    </w:p>
+    <w:p>
+      <w:pPr>
+        <w:spacing w:after="120"/>
+      </w:pPr>
+      <w:r>
+        <w:rPr>
+          <w:noProof/>
+        </w:rPr>
+        <w:drawing>
+          <wp:inline distT="0" distB="0" distL="0" distR="0" wp14:anchorId="55C682E2" wp14:editId="14740458">
+            <wp:extent cx="5943600" cy="3019425"/>
+            <wp:effectExtent l="76200" t="76200" r="133350" b="142875"/>
+            <wp:docPr id="22038594" name="Picture 8"/>
+            <wp:cNvGraphicFramePr>
+              <a:graphicFrameLocks xmlns:a="http://schemas.openxmlformats.org/drawingml/2006/main" noChangeAspect="1"/>
+            </wp:cNvGraphicFramePr>
+            <a:graphic xmlns:a="http://schemas.openxmlformats.org/drawingml/2006/main">
+              <a:graphicData uri="http://schemas.openxmlformats.org/drawingml/2006/picture">
+                <pic:pic xmlns:pic="http://schemas.openxmlformats.org/drawingml/2006/picture">
+                  <pic:nvPicPr>
+                    <pic:cNvPr id="22038594" name="Picture 22038594"/>
+                    <pic:cNvPicPr/>
+                  </pic:nvPicPr>
+                  <pic:blipFill>
+                    <a:blip r:embed="rId13">
+                      <a:extLst>
+                        <a:ext uri="{28A0092B-C50C-407E-A947-70E740481C1C}">
+                          <a14:useLocalDpi xmlns:a14="http://schemas.microsoft.com/office/drawing/2010/main" val="0"/>
+                        </a:ext>
+                      </a:extLst>
+                    </a:blip>
+                    <a:stretch>
+                      <a:fillRect/>
+                    </a:stretch>
+                  </pic:blipFill>
+                  <pic:spPr>
+                    <a:xfrm>
+                      <a:off x="0" y="0"/>
+                      <a:ext cx="5943600" cy="3019425"/>
+                    </a:xfrm>
+                    <a:prstGeom prst="rect">
+                      <a:avLst/>
+                    </a:prstGeom>
+                    <a:ln w="38100" cap="sq">
+                      <a:solidFill>
+                        <a:srgbClr val="000000"/>
+                      </a:solidFill>
+                      <a:prstDash val="solid"/>
+                      <a:miter lim="800000"/>
+                    </a:ln>
+                    <a:effectLst>
+                      <a:outerShdw blurRad="50800" dist="38100" dir="2700000" algn="tl" rotWithShape="0">
+                        <a:srgbClr val="000000">
+                          <a:alpha val="43000"/>
+                        </a:srgbClr>
+                      </a:outerShdw>
+                    </a:effectLst>
+                  </pic:spPr>
+                </pic:pic>
+              </a:graphicData>
+            </a:graphic>
+          </wp:inline>
+        </w:drawing>
+      </w:r>
+    </w:p>
+    <w:p>
+      <w:pPr>
+        <w:pStyle w:val="Heading3"/>
+        <w:spacing w:before="200" w:after="100"/>
+      </w:pPr>
+      <w:r>
+        <w:t>Deletion</w:t>
+      </w:r>
+    </w:p>
+    <w:p>
+      <w:pPr>
+        <w:pStyle w:val="ListParagraph"/>
+        <w:numPr>
+          <w:ilvl w:val="0"/>
+          <w:numId w:val="2"/>
+        </w:numPr>
+        <w:spacing w:after="60"/>
+      </w:pPr>
+      <w:r>
+        <w:t>Row (listwise) deletion: drop rows containing missing values. A common rule of thumb is to drop the rows only if the missing values make up less than about 5% of the data — the information lost is minimal and it avoids introducing any imputation bias.</w:t>
+      </w:r>
+    </w:p>
+    <w:p>
+      <w:pPr>
+        <w:pStyle w:val="ListParagraph"/>
+        <w:numPr>
+          <w:ilvl w:val="0"/>
+          <w:numId w:val="2"/>
+        </w:numPr>
+        <w:spacing w:after="60"/>
+      </w:pPr>
+      <w:r>
+        <w:lastRenderedPageBreak/>
+        <w:t>Column deletion: drop an entire feature/column if a very large proportion of its values are missing (commonly cited threshold: above 30-40%)</w:t>
+      </w:r>
+    </w:p>
+    <w:p>
+      <w:pPr>
+        <w:pStyle w:val="Heading3"/>
+        <w:spacing w:before="200" w:after="100"/>
+      </w:pPr>
+      <w:r>
+        <w:t>Imputation</w:t>
+      </w:r>
+    </w:p>
+    <w:p>
+      <w:pPr>
+        <w:pStyle w:val="ListParagraph"/>
+        <w:numPr>
+          <w:ilvl w:val="0"/>
+          <w:numId w:val="2"/>
+        </w:numPr>
+        <w:spacing w:after="60"/>
+      </w:pPr>
+      <w:r>
+        <w:t>Mean/Median imputation: fill missing numeric values with the column's mean (or median, if the data has outliers/skew)</w:t>
+      </w:r>
+    </w:p>
+    <w:p>
+      <w:pPr>
+        <w:pStyle w:val="ListParagraph"/>
+        <w:numPr>
+          <w:ilvl w:val="0"/>
+          <w:numId w:val="2"/>
+        </w:numPr>
+        <w:spacing w:after="60"/>
+      </w:pPr>
+      <w:r>
+        <w:t>Mode imputation: fill missing categorical values with the most frequent category</w:t>
+      </w:r>
+    </w:p>
+    <w:p>
+      <w:pPr>
+        <w:pStyle w:val="ListParagraph"/>
+        <w:numPr>
+          <w:ilvl w:val="0"/>
+          <w:numId w:val="2"/>
+        </w:numPr>
+        <w:spacing w:after="60"/>
+      </w:pPr>
+      <w:r>
+        <w:t>Model-based imputation: predict missing values using other features (e.g., kNN imputation, regression imputation)</w:t>
+      </w:r>
+    </w:p>
+    <w:p>
+      <w:pPr>
+        <w:pStyle w:val="Heading3"/>
+        <w:spacing w:before="200" w:after="100"/>
+      </w:pPr>
+      <w:r>
+        <w:t>Quick Guideline by Missing Percentage</w:t>
+      </w:r>
+    </w:p>
+    <w:tbl>
+      <w:tblPr>
+        <w:tblW w:w="9360" w:type="dxa"/>
+        <w:tblBorders>
+          <w:top w:val="single" w:sz="4" w:space="0" w:color="auto"/>
+          <w:left w:val="single" w:sz="4" w:space="0" w:color="auto"/>
+          <w:bottom w:val="single" w:sz="4" w:space="0" w:color="auto"/>
+          <w:right w:val="single" w:sz="4" w:space="0" w:color="auto"/>
+          <w:insideH w:val="single" w:sz="4" w:space="0" w:color="auto"/>
+          <w:insideV w:val="single" w:sz="4" w:space="0" w:color="auto"/>
+        </w:tblBorders>
+        <w:tblCellMar>
+          <w:left w:w="10" w:type="dxa"/>
+          <w:right w:w="10" w:type="dxa"/>
+        </w:tblCellMar>
+        <w:tblLook w:val="04A0" w:firstRow="1" w:lastRow="0" w:firstColumn="1" w:lastColumn="0" w:noHBand="0" w:noVBand="1"/>
+      </w:tblPr>
+      <w:tblGrid>
+        <w:gridCol w:w="4680"/>
+        <w:gridCol w:w="4680"/>
+      </w:tblGrid>
+      <w:tr>
+        <w:trPr>
+          <w:tblHeader/>
+        </w:trPr>
+        <w:tc>
+          <w:tcPr>
+            <w:tcW w:w="4680" w:type="dxa"/>
+            <w:shd w:val="clear" w:color="auto" w:fill="2E5395"/>
+          </w:tcPr>
+          <w:p>
+            <w:r>
+              <w:rPr>
+                <w:b/>
+                <w:bCs/>
+                <w:color w:val="FFFFFF"/>
+              </w:rPr>
+              <w:t>Missing %</w:t>
+            </w:r>
+          </w:p>
+        </w:tc>
+        <w:tc>
+          <w:tcPr>
+            <w:tcW w:w="4680" w:type="dxa"/>
+            <w:shd w:val="clear" w:color="auto" w:fill="2E5395"/>
+          </w:tcPr>
+          <w:p>
+            <w:r>
+              <w:rPr>
+                <w:b/>
+                <w:bCs/>
+                <w:color w:val="FFFFFF"/>
+              </w:rPr>
+              <w:t>Recommended Action</w:t>
+            </w:r>
+          </w:p>
+        </w:tc>
+      </w:tr>
+      <w:tr>
+        <w:tc>
+          <w:tcPr>
+            <w:tcW w:w="4680" w:type="dxa"/>
+          </w:tcPr>
+          <w:p>
+            <w:r>
+              <w:t>Less than 5%</w:t>
+            </w:r>
+          </w:p>
+        </w:tc>
+        <w:tc>
+          <w:tcPr>
+            <w:tcW w:w="4680" w:type="dxa"/>
+          </w:tcPr>
+          <w:p>
+            <w:r>
+              <w:t>Remove (drop) the affected rows</w:t>
+            </w:r>
+          </w:p>
+        </w:tc>
+      </w:tr>
+      <w:tr>
+        <w:tc>
+          <w:tcPr>
+            <w:tcW w:w="4680" w:type="dxa"/>
+            <w:shd w:val="clear" w:color="auto" w:fill="F2F6FC"/>
+          </w:tcPr>
+          <w:p>
+            <w:r>
+              <w:t>5% - 30%</w:t>
+            </w:r>
+          </w:p>
+        </w:tc>
+        <w:tc>
+          <w:tcPr>
+            <w:tcW w:w="4680" w:type="dxa"/>
+            <w:shd w:val="clear" w:color="auto" w:fill="F2F6FC"/>
+          </w:tcPr>
+          <w:p>
+            <w:r>
+              <w:t>Impute (mean/median/mode or model-based)</w:t>
+            </w:r>
+          </w:p>
+        </w:tc>
+      </w:tr>
+      <w:tr>
+        <w:tc>
+          <w:tcPr>
+            <w:tcW w:w="4680" w:type="dxa"/>
+          </w:tcPr>
+          <w:p>
+            <w:r>
+              <w:t>Above 30-40%</w:t>
+            </w:r>
+          </w:p>
+        </w:tc>
+        <w:tc>
+          <w:tcPr>
+            <w:tcW w:w="4680" w:type="dxa"/>
+          </w:tcPr>
+          <w:p>
+            <w:r>
+              <w:t>Consider dropping the entire column, unless it is known to be important</w:t>
+            </w:r>
+          </w:p>
+        </w:tc>
+      </w:tr>
+    </w:tbl>
+    <w:p>
+      <w:pPr>
+        <w:spacing w:after="200"/>
+      </w:pPr>
     </w:p>
     <w:p>
       <w:pPr>
@@ -1334,7 +2422,7 @@
         <w:spacing w:before="240" w:after="120"/>
       </w:pPr>
       <w:r>
-        <w:t>Cross-Validation</w:t>
+        <w:t>Encoding Categorical Features</w:t>
       </w:r>
     </w:p>
     <w:p>
@@ -1342,7 +2430,136 @@
         <w:spacing w:after="120"/>
       </w:pPr>
       <w:r>
-        <w:t>Cross-validation extends the train/test split idea by repeatedly partitioning the data, so every observation gets a chance to be used for both training and testing.</w:t>
+        <w:t>Most ML algorithms require numeric input, so categorical (text/label) features must be converted into numbers before training.</w:t>
+      </w:r>
+    </w:p>
+    <w:p>
+      <w:pPr>
+        <w:spacing w:after="120"/>
+      </w:pPr>
+      <w:r>
+        <w:rPr>
+          <w:noProof/>
+        </w:rPr>
+        <w:drawing>
+          <wp:inline distT="0" distB="0" distL="0" distR="0" wp14:anchorId="75B7972C" wp14:editId="4AC725D4">
+            <wp:extent cx="5943600" cy="2752725"/>
+            <wp:effectExtent l="76200" t="76200" r="133350" b="142875"/>
+            <wp:docPr id="1537138860" name="Picture 9"/>
+            <wp:cNvGraphicFramePr>
+              <a:graphicFrameLocks xmlns:a="http://schemas.openxmlformats.org/drawingml/2006/main" noChangeAspect="1"/>
+            </wp:cNvGraphicFramePr>
+            <a:graphic xmlns:a="http://schemas.openxmlformats.org/drawingml/2006/main">
+              <a:graphicData uri="http://schemas.openxmlformats.org/drawingml/2006/picture">
+                <pic:pic xmlns:pic="http://schemas.openxmlformats.org/drawingml/2006/picture">
+                  <pic:nvPicPr>
+                    <pic:cNvPr id="1537138860" name="Picture 1537138860"/>
+                    <pic:cNvPicPr/>
+                  </pic:nvPicPr>
+                  <pic:blipFill>
+                    <a:blip r:embed="rId14">
+                      <a:extLst>
+                        <a:ext uri="{28A0092B-C50C-407E-A947-70E740481C1C}">
+                          <a14:useLocalDpi xmlns:a14="http://schemas.microsoft.com/office/drawing/2010/main" val="0"/>
+                        </a:ext>
+                      </a:extLst>
+                    </a:blip>
+                    <a:stretch>
+                      <a:fillRect/>
+                    </a:stretch>
+                  </pic:blipFill>
+                  <pic:spPr>
+                    <a:xfrm>
+                      <a:off x="0" y="0"/>
+                      <a:ext cx="5943600" cy="2752725"/>
+                    </a:xfrm>
+                    <a:prstGeom prst="rect">
+                      <a:avLst/>
+                    </a:prstGeom>
+                    <a:ln w="38100" cap="sq">
+                      <a:solidFill>
+                        <a:srgbClr val="000000"/>
+                      </a:solidFill>
+                      <a:prstDash val="solid"/>
+                      <a:miter lim="800000"/>
+                    </a:ln>
+                    <a:effectLst>
+                      <a:outerShdw blurRad="50800" dist="38100" dir="2700000" algn="tl" rotWithShape="0">
+                        <a:srgbClr val="000000">
+                          <a:alpha val="43000"/>
+                        </a:srgbClr>
+                      </a:outerShdw>
+                    </a:effectLst>
+                  </pic:spPr>
+                </pic:pic>
+              </a:graphicData>
+            </a:graphic>
+          </wp:inline>
+        </w:drawing>
+      </w:r>
+    </w:p>
+    <w:p>
+      <w:pPr>
+        <w:pStyle w:val="Heading3"/>
+        <w:spacing w:before="200" w:after="100"/>
+      </w:pPr>
+      <w:r>
+        <w:t>Label Encoding</w:t>
+      </w:r>
+    </w:p>
+    <w:p>
+      <w:pPr>
+        <w:spacing w:after="120"/>
+      </w:pPr>
+      <w:r>
+        <w:t>Assigns each category an integer (e.g., Red=0, Green=1, Blue=2). Compact, but implies a false ordinal relationship between categories, so it's best reserved for naturally ordered (ordinal) categories or for tree-based models, which don't assume a linear relationship between the encoded values.</w:t>
+      </w:r>
+    </w:p>
+    <w:p>
+      <w:pPr>
+        <w:pStyle w:val="Heading3"/>
+        <w:spacing w:before="200" w:after="100"/>
+      </w:pPr>
+      <w:r>
+        <w:t>One-Hot Encoding</w:t>
+      </w:r>
+    </w:p>
+    <w:p>
+      <w:pPr>
+        <w:spacing w:after="120"/>
+      </w:pPr>
+      <w:r>
+        <w:t xml:space="preserve">Creates a new binary (0/1) column for each category, with a 1 marking which category is present. For a "Color" feature with values Red/Green/Blue, one-hot encoding produces three columns: Color_Red, Color_Green, </w:t>
+      </w:r>
+      <w:r>
+        <w:lastRenderedPageBreak/>
+        <w:t>Color_Blue. It avoids implying any order between categories, which makes it the standard choice for nominal (unordered) categorical features, especially for distance-based and linear models.</w:t>
+      </w:r>
+    </w:p>
+    <w:p>
+      <w:pPr>
+        <w:pStyle w:val="ListParagraph"/>
+        <w:numPr>
+          <w:ilvl w:val="0"/>
+          <w:numId w:val="2"/>
+        </w:numPr>
+        <w:spacing w:after="60"/>
+      </w:pPr>
+      <w:r>
+        <w:t>Increases dimensionality — can become impractical for features with very high cardinality (many unique categories)</w:t>
+      </w:r>
+    </w:p>
+    <w:p>
+      <w:pPr>
+        <w:pStyle w:val="ListParagraph"/>
+        <w:numPr>
+          <w:ilvl w:val="0"/>
+          <w:numId w:val="2"/>
+        </w:numPr>
+        <w:spacing w:after="60"/>
+      </w:pPr>
+      <w:r>
+        <w:t>One column is sometimes dropped (drop_first) to avoid redundant/collinear columns for linear models</w:t>
       </w:r>
     </w:p>
     <w:p>
@@ -1351,7 +2568,7 @@
         <w:spacing w:before="240" w:after="120"/>
       </w:pPr>
       <w:r>
-        <w:t>k-Fold Cross-Validation</w:t>
+        <w:t>Use Cases</w:t>
       </w:r>
     </w:p>
     <w:p>
@@ -1359,267 +2576,7 @@
         <w:spacing w:after="120"/>
       </w:pPr>
       <w:r>
-        <w:t>The dataset is divided into k equally sized folds. The model is trained on k-1 folds and tested on the remaining fold; this is repeated k times so each fold serves as the test set once. The final performance is the average across all k runs.</w:t>
-      </w:r>
-    </w:p>
-    <w:p>
-      <w:pPr>
-        <w:pStyle w:val="ListParagraph"/>
-        <w:numPr>
-          <w:ilvl w:val="0"/>
-          <w:numId w:val="2"/>
-        </w:numPr>
-        <w:spacing w:after="60"/>
-      </w:pPr>
-      <w:r>
-        <w:t>Typical values: k = 5 or k = 10</w:t>
-      </w:r>
-    </w:p>
-    <w:p>
-      <w:pPr>
-        <w:pStyle w:val="ListParagraph"/>
-        <w:numPr>
-          <w:ilvl w:val="0"/>
-          <w:numId w:val="2"/>
-        </w:numPr>
-        <w:spacing w:after="60"/>
-      </w:pPr>
-      <w:r>
-        <w:t>Reduces the impact of any single, potentially unrepresentative, train/test split</w:t>
-      </w:r>
-    </w:p>
-    <w:p>
-      <w:pPr>
-        <w:pStyle w:val="Heading2"/>
-        <w:spacing w:before="240" w:after="120"/>
-      </w:pPr>
-      <w:r>
-        <w:t>Stratified k-Fold</w:t>
-      </w:r>
-    </w:p>
-    <w:p>
-      <w:pPr>
-        <w:spacing w:after="120"/>
-      </w:pPr>
-      <w:r>
-        <w:t>A variant of k-fold cross-validation that preserves the class distribution within each fold, which is especially important for imbalanced classification problems.</w:t>
-      </w:r>
-    </w:p>
-    <w:p>
-      <w:pPr>
-        <w:pStyle w:val="Heading2"/>
-        <w:spacing w:before="240" w:after="120"/>
-      </w:pPr>
-      <w:r>
-        <w:t>Leave-One-Out Cross-Validation (LOOCV)</w:t>
-      </w:r>
-    </w:p>
-    <w:p>
-      <w:pPr>
-        <w:spacing w:after="120"/>
-      </w:pPr>
-      <w:r>
-        <w:t>A special case of k-fold cross-validation where k equals the number of samples (n). Each observation is used once as the test set while the rest form the training set.</w:t>
-      </w:r>
-    </w:p>
-    <w:p>
-      <w:pPr>
-        <w:pStyle w:val="ListParagraph"/>
-        <w:numPr>
-          <w:ilvl w:val="0"/>
-          <w:numId w:val="2"/>
-        </w:numPr>
-        <w:spacing w:after="60"/>
-      </w:pPr>
-      <w:r>
-        <w:t>Makes maximal use of the available data</w:t>
-      </w:r>
-    </w:p>
-    <w:p>
-      <w:pPr>
-        <w:pStyle w:val="ListParagraph"/>
-        <w:numPr>
-          <w:ilvl w:val="0"/>
-          <w:numId w:val="2"/>
-        </w:numPr>
-        <w:spacing w:after="60"/>
-      </w:pPr>
-      <w:r>
-        <w:t>Computationally expensive for large datasets, since the model is trained n times</w:t>
-      </w:r>
-    </w:p>
-    <w:p>
-      <w:pPr>
-        <w:pStyle w:val="Heading2"/>
-        <w:spacing w:before="240" w:after="120"/>
-      </w:pPr>
-      <w:r>
-        <w:t>Why Use Cross-Validation</w:t>
-      </w:r>
-    </w:p>
-    <w:p>
-      <w:pPr>
-        <w:pStyle w:val="ListParagraph"/>
-        <w:numPr>
-          <w:ilvl w:val="0"/>
-          <w:numId w:val="2"/>
-        </w:numPr>
-        <w:spacing w:after="60"/>
-      </w:pPr>
-      <w:r>
-        <w:t>Gives a more reliable estimate of model performance than a single train/test split</w:t>
-      </w:r>
-    </w:p>
-    <w:p>
-      <w:pPr>
-        <w:pStyle w:val="ListParagraph"/>
-        <w:numPr>
-          <w:ilvl w:val="0"/>
-          <w:numId w:val="2"/>
-        </w:numPr>
-        <w:spacing w:after="60"/>
-      </w:pPr>
-      <w:r>
-        <w:t>Reduces variance caused by a particularly lucky or unlucky split</w:t>
-      </w:r>
-    </w:p>
-    <w:p>
-      <w:pPr>
-        <w:pStyle w:val="ListParagraph"/>
-        <w:numPr>
-          <w:ilvl w:val="0"/>
-          <w:numId w:val="2"/>
-        </w:numPr>
-        <w:spacing w:after="60"/>
-      </w:pPr>
-      <w:r>
-        <w:t>Makes efficient use of limited data, since every sample is used for both training and testing</w:t>
-      </w:r>
-    </w:p>
-    <w:p>
-      <w:pPr>
-        <w:pStyle w:val="ListParagraph"/>
-        <w:numPr>
-          <w:ilvl w:val="0"/>
-          <w:numId w:val="2"/>
-        </w:numPr>
-        <w:spacing w:after="60"/>
-      </w:pPr>
-      <w:r>
-        <w:t>Commonly used for model selection and hyperparameter tuning (e.g., choosing k in kNN)</w:t>
-      </w:r>
-    </w:p>
-    <w:p>
-      <w:pPr>
-        <w:pStyle w:val="Heading2"/>
-        <w:spacing w:before="240" w:after="120"/>
-      </w:pPr>
-      <w:r>
-        <w:t>Advantages</w:t>
-      </w:r>
-    </w:p>
-    <w:p>
-      <w:pPr>
-        <w:pStyle w:val="ListParagraph"/>
-        <w:numPr>
-          <w:ilvl w:val="0"/>
-          <w:numId w:val="2"/>
-        </w:numPr>
-        <w:spacing w:after="60"/>
-      </w:pPr>
-      <w:r>
-        <w:t>More robust and less biased estimate of model performance</w:t>
-      </w:r>
-    </w:p>
-    <w:p>
-      <w:pPr>
-        <w:pStyle w:val="ListParagraph"/>
-        <w:numPr>
-          <w:ilvl w:val="0"/>
-          <w:numId w:val="2"/>
-        </w:numPr>
-        <w:spacing w:after="60"/>
-      </w:pPr>
-      <w:r>
-        <w:t>Helps detect overfitting before deployment</w:t>
-      </w:r>
-    </w:p>
-    <w:p>
-      <w:pPr>
-        <w:pStyle w:val="ListParagraph"/>
-        <w:numPr>
-          <w:ilvl w:val="0"/>
-          <w:numId w:val="2"/>
-        </w:numPr>
-        <w:spacing w:after="60"/>
-      </w:pPr>
-      <w:r>
-        <w:t>Makes better use of small datasets compared to a single fixed split</w:t>
-      </w:r>
-    </w:p>
-    <w:p>
-      <w:pPr>
-        <w:pStyle w:val="Heading2"/>
-        <w:spacing w:before="240" w:after="120"/>
-      </w:pPr>
-      <w:r>
-        <w:t>Disadvantages</w:t>
-      </w:r>
-    </w:p>
-    <w:p>
-      <w:pPr>
-        <w:pStyle w:val="ListParagraph"/>
-        <w:numPr>
-          <w:ilvl w:val="0"/>
-          <w:numId w:val="2"/>
-        </w:numPr>
-        <w:spacing w:after="60"/>
-      </w:pPr>
-      <w:r>
-        <w:t>More computationally expensive than a single train/test split, especially for large k or LOOCV</w:t>
-      </w:r>
-    </w:p>
-    <w:p>
-      <w:pPr>
-        <w:pStyle w:val="ListParagraph"/>
-        <w:numPr>
-          <w:ilvl w:val="0"/>
-          <w:numId w:val="2"/>
-        </w:numPr>
-        <w:spacing w:after="60"/>
-      </w:pPr>
-      <w:r>
-        <w:t>Not ideal for time-series data unless using time-aware variants (e.g., rolling/expanding window validation)</w:t>
-      </w:r>
-    </w:p>
-    <w:p>
-      <w:pPr>
-        <w:pStyle w:val="ListParagraph"/>
-        <w:numPr>
-          <w:ilvl w:val="0"/>
-          <w:numId w:val="2"/>
-        </w:numPr>
-        <w:spacing w:after="60"/>
-      </w:pPr>
-      <w:r>
-        <w:t>Results can still vary depending on how folds are constructed</w:t>
-      </w:r>
-    </w:p>
-    <w:p>
-      <w:pPr>
-        <w:pStyle w:val="Heading2"/>
-        <w:spacing w:before="240" w:after="120"/>
-      </w:pPr>
-      <w:r>
-        <w:t>Use Cases</w:t>
-      </w:r>
-    </w:p>
-    <w:p>
-      <w:pPr>
-        <w:spacing w:after="120"/>
-      </w:pPr>
-      <w:r>
-        <w:t>Model evaluation, hyperparameter tuning, comparing algorithms, and validating models before deployment in any supervised learning task.</w:t>
+        <w:t>Applied as standard preprocessing steps before nearly any supervised or unsupervised learning task — especially kNN, SVM, linear/logistic regression, clustering, and neural networks, where unscaled or non-numeric inputs would otherwise distort the model.</w:t>
       </w:r>
     </w:p>
     <w:p>
@@ -1663,12 +2620,6 @@
         <w:gridCol w:w="2340"/>
       </w:tblGrid>
       <w:tr>
-        <w:tblPrEx>
-          <w:tblCellMar>
-            <w:top w:w="0" w:type="dxa"/>
-            <w:bottom w:w="0" w:type="dxa"/>
-          </w:tblCellMar>
-        </w:tblPrEx>
         <w:trPr>
           <w:tblHeader/>
         </w:trPr>
@@ -1738,12 +2689,6 @@
         </w:tc>
       </w:tr>
       <w:tr>
-        <w:tblPrEx>
-          <w:tblCellMar>
-            <w:top w:w="0" w:type="dxa"/>
-            <w:bottom w:w="0" w:type="dxa"/>
-          </w:tblCellMar>
-        </w:tblPrEx>
         <w:tc>
           <w:tcPr>
             <w:tcW w:w="2340" w:type="dxa"/>
@@ -1786,12 +2731,6 @@
         </w:tc>
       </w:tr>
       <w:tr>
-        <w:tblPrEx>
-          <w:tblCellMar>
-            <w:top w:w="0" w:type="dxa"/>
-            <w:bottom w:w="0" w:type="dxa"/>
-          </w:tblCellMar>
-        </w:tblPrEx>
         <w:tc>
           <w:tcPr>
             <w:tcW w:w="2340" w:type="dxa"/>
@@ -1838,12 +2777,6 @@
         </w:tc>
       </w:tr>
       <w:tr>
-        <w:tblPrEx>
-          <w:tblCellMar>
-            <w:top w:w="0" w:type="dxa"/>
-            <w:bottom w:w="0" w:type="dxa"/>
-          </w:tblCellMar>
-        </w:tblPrEx>
         <w:tc>
           <w:tcPr>
             <w:tcW w:w="2340" w:type="dxa"/>
@@ -1886,12 +2819,6 @@
         </w:tc>
       </w:tr>
       <w:tr>
-        <w:tblPrEx>
-          <w:tblCellMar>
-            <w:top w:w="0" w:type="dxa"/>
-            <w:bottom w:w="0" w:type="dxa"/>
-          </w:tblCellMar>
-        </w:tblPrEx>
         <w:tc>
           <w:tcPr>
             <w:tcW w:w="2340" w:type="dxa"/>
@@ -1938,12 +2865,6 @@
         </w:tc>
       </w:tr>
       <w:tr>
-        <w:tblPrEx>
-          <w:tblCellMar>
-            <w:top w:w="0" w:type="dxa"/>
-            <w:bottom w:w="0" w:type="dxa"/>
-          </w:tblCellMar>
-        </w:tblPrEx>
         <w:tc>
           <w:tcPr>
             <w:tcW w:w="2340" w:type="dxa"/>
@@ -1986,12 +2907,6 @@
         </w:tc>
       </w:tr>
       <w:tr>
-        <w:tblPrEx>
-          <w:tblCellMar>
-            <w:top w:w="0" w:type="dxa"/>
-            <w:bottom w:w="0" w:type="dxa"/>
-          </w:tblCellMar>
-        </w:tblPrEx>
         <w:tc>
           <w:tcPr>
             <w:tcW w:w="2340" w:type="dxa"/>
@@ -2038,12 +2953,6 @@
         </w:tc>
       </w:tr>
       <w:tr>
-        <w:tblPrEx>
-          <w:tblCellMar>
-            <w:top w:w="0" w:type="dxa"/>
-            <w:bottom w:w="0" w:type="dxa"/>
-          </w:tblCellMar>
-        </w:tblPrEx>
         <w:tc>
           <w:tcPr>
             <w:tcW w:w="2340" w:type="dxa"/>
@@ -2086,12 +2995,6 @@
         </w:tc>
       </w:tr>
       <w:tr>
-        <w:tblPrEx>
-          <w:tblCellMar>
-            <w:top w:w="0" w:type="dxa"/>
-            <w:bottom w:w="0" w:type="dxa"/>
-          </w:tblCellMar>
-        </w:tblPrEx>
         <w:tc>
           <w:tcPr>
             <w:tcW w:w="2340" w:type="dxa"/>
@@ -2175,7 +3078,7 @@
         <w:spacing w:after="60"/>
       </w:pPr>
       <w:r>
-        <w:t xml:space="preserve">kNN classifies based on proximity to neighboring points; simple but computationally costly at prediction time.</w:t>
+        <w:t>kNN classifies based on proximity to neighboring points; simple but computationally costly at prediction time.</w:t>
       </w:r>
     </w:p>
     <w:p>
@@ -2204,8 +3107,21 @@
         <w:t>Train/Test Split and Cross-Validation estimate how well a model generalizes to unseen data and help guard against overfitting during evaluation.</w:t>
       </w:r>
     </w:p>
+    <w:p>
+      <w:pPr>
+        <w:pStyle w:val="ListParagraph"/>
+        <w:numPr>
+          <w:ilvl w:val="0"/>
+          <w:numId w:val="2"/>
+        </w:numPr>
+        <w:spacing w:after="60"/>
+      </w:pPr>
+      <w:r>
+        <w:t>Feature Scaling, Handling Missing Data, and Encoding Categorical Features prepare raw data for modeling: scale numeric ranges (e.g., StandardScaler), drop or impute missing values depending on how much is missing (e.g., drop rows below 5%), and convert categories into numbers (e.g., one-hot encoding).</w:t>
+      </w:r>
+    </w:p>
     <w:sectPr>
-      <w:footerReference w:type="default" r:id="rId7"/>
+      <w:footerReference w:type="default" r:id="rId15"/>
       <w:pgSz w:w="12240" w:h="15840"/>
       <w:pgMar w:top="1440" w:right="1440" w:bottom="1440" w:left="1440" w:header="708" w:footer="708" w:gutter="0"/>
       <w:pgBorders w:offsetFrom="page">

</xml_diff>